<commit_message>
Initial commit - Research Project
</commit_message>
<xml_diff>
--- a/reports/Tag Book v1.docx
+++ b/reports/Tag Book v1.docx
@@ -1,55 +1,10 @@
 
 <file path=word/document.xml><?xml version="1.0" encoding="utf-8"?>
-<w:document xmlns:wpc="http://schemas.microsoft.com/office/word/2010/wordprocessingCanvas" xmlns:cx="http://schemas.microsoft.com/office/drawing/2014/chartex" xmlns:cx1="http://schemas.microsoft.com/office/drawing/2015/9/8/chartex" xmlns:cx2="http://schemas.microsoft.com/office/drawing/2015/10/21/chartex" xmlns:cx3="http://schemas.microsoft.com/office/drawing/2016/5/9/chartex" xmlns:cx4="http://schemas.microsoft.com/office/drawing/2016/5/10/chartex" xmlns:cx5="http://schemas.microsoft.com/office/drawing/2016/5/11/chartex" xmlns:cx6="http://schemas.microsoft.com/office/drawing/2016/5/12/chartex" xmlns:cx7="http://schemas.microsoft.com/office/drawing/2016/5/13/chartex" xmlns:cx8="http://schemas.microsoft.com/office/drawing/2016/5/14/chartex" xmlns:mc="http://schemas.openxmlformats.org/markup-compatibility/2006" xmlns:aink="http://schemas.microsoft.com/office/drawing/2016/ink" xmlns:am3d="http://schemas.microsoft.com/office/drawing/2017/model3d" xmlns:o="urn:schemas-microsoft-com:office:office" xmlns:oel="http://schemas.microsoft.com/office/2019/extlst" xmlns:r="http://schemas.openxmlformats.org/officeDocument/2006/relationships" xmlns:m="http://schemas.openxmlformats.org/officeDocument/2006/math" xmlns:v="urn:schemas-microsoft-com:vml" xmlns:wp14="http://schemas.microsoft.com/office/word/2010/wordprocessingDrawing" xmlns:wp="http://schemas.openxmlformats.org/drawingml/2006/wordprocessingDrawing" xmlns:w10="urn:schemas-microsoft-com:office:word" xmlns:w="http://schemas.openxmlformats.org/wordprocessingml/2006/main" xmlns:w14="http://schemas.microsoft.com/office/word/2010/wordml" xmlns:w15="http://schemas.microsoft.com/office/word/2012/wordml" xmlns:w16cex="http://schemas.microsoft.com/office/word/2018/wordml/cex" xmlns:w16cid="http://schemas.microsoft.com/office/word/2016/wordml/cid" xmlns:w16="http://schemas.microsoft.com/office/word/2018/wordml" xmlns:w16du="http://schemas.microsoft.com/office/word/2023/wordml/word16du" xmlns:w16sdtdh="http://schemas.microsoft.com/office/word/2020/wordml/sdtdatahash" xmlns:w16sdtfl="http://schemas.microsoft.com/office/word/2024/wordml/sdtformatlock" xmlns:w16se="http://schemas.microsoft.com/office/word/2015/wordml/symex" xmlns:wpg="http://schemas.microsoft.com/office/word/2010/wordprocessingGroup" xmlns:wpi="http://schemas.microsoft.com/office/word/2010/wordprocessingInk" xmlns:wne="http://schemas.microsoft.com/office/word/2006/wordml" xmlns:wps="http://schemas.microsoft.com/office/word/2010/wordprocessingShape" mc:Ignorable="w14 w15 w16se w16cid w16 w16cex w16sdtdh w16sdtfl w16du wp14">
+<w:document xmlns:wpc="http://schemas.microsoft.com/office/word/2010/wordprocessingCanvas" xmlns:cx="http://schemas.microsoft.com/office/drawing/2014/chartex" xmlns:cx1="http://schemas.microsoft.com/office/drawing/2015/9/8/chartex" xmlns:cx2="http://schemas.microsoft.com/office/drawing/2015/10/21/chartex" xmlns:cx3="http://schemas.microsoft.com/office/drawing/2016/5/9/chartex" xmlns:cx4="http://schemas.microsoft.com/office/drawing/2016/5/10/chartex" xmlns:cx5="http://schemas.microsoft.com/office/drawing/2016/5/11/chartex" xmlns:cx6="http://schemas.microsoft.com/office/drawing/2016/5/12/chartex" xmlns:cx7="http://schemas.microsoft.com/office/drawing/2016/5/13/chartex" xmlns:cx8="http://schemas.microsoft.com/office/drawing/2016/5/14/chartex" xmlns:mc="http://schemas.openxmlformats.org/markup-compatibility/2006" xmlns:aink="http://schemas.microsoft.com/office/drawing/2016/ink" xmlns:am3d="http://schemas.microsoft.com/office/drawing/2017/model3d" xmlns:o="urn:schemas-microsoft-com:office:office" xmlns:oel="http://schemas.microsoft.com/office/2019/extlst" xmlns:r="http://schemas.openxmlformats.org/officeDocument/2006/relationships" xmlns:m="http://schemas.openxmlformats.org/officeDocument/2006/math" xmlns:v="urn:schemas-microsoft-com:vml" xmlns:wp14="http://schemas.microsoft.com/office/word/2010/wordprocessingDrawing" xmlns:wp="http://schemas.openxmlformats.org/drawingml/2006/wordprocessingDrawing" xmlns:w10="urn:schemas-microsoft-com:office:word" xmlns:w="http://schemas.openxmlformats.org/wordprocessingml/2006/main" xmlns:w14="http://schemas.microsoft.com/office/word/2010/wordml" xmlns:w15="http://schemas.microsoft.com/office/word/2012/wordml" xmlns:w16cex="http://schemas.microsoft.com/office/word/2018/wordml/cex" xmlns:w16cid="http://schemas.microsoft.com/office/word/2016/wordml/cid" xmlns:w16="http://schemas.microsoft.com/office/word/2018/wordml" xmlns:w16du="http://schemas.microsoft.com/office/word/2023/wordml/word16du" xmlns:w16sdtdh="http://schemas.microsoft.com/office/word/2020/wordml/sdtdatahash" xmlns:w16se="http://schemas.microsoft.com/office/word/2015/wordml/symex" xmlns:wpg="http://schemas.microsoft.com/office/word/2010/wordprocessingGroup" xmlns:wpi="http://schemas.microsoft.com/office/word/2010/wordprocessingInk" xmlns:wne="http://schemas.microsoft.com/office/word/2006/wordml" xmlns:wps="http://schemas.microsoft.com/office/word/2010/wordprocessingShape" mc:Ignorable="w14 w15 w16se w16cid w16 w16cex w16sdtdh w16du wp14">
   <w:body>
     <w:p>
       <w:pPr>
-        <w:rPr>
-          <w:rFonts w:ascii="Times New Roman" w:hAnsi="Times New Roman" w:cs="Times New Roman"/>
-          <w:b/>
-          <w:bCs/>
-          <w:sz w:val="24"/>
-          <w:szCs w:val="24"/>
-        </w:rPr>
-      </w:pPr>
-      <w:r>
-        <w:rPr>
-          <w:rFonts w:ascii="Times New Roman" w:hAnsi="Times New Roman" w:cs="Times New Roman"/>
-          <w:b/>
-          <w:bCs/>
-          <w:sz w:val="24"/>
-          <w:szCs w:val="24"/>
-        </w:rPr>
-        <w:t xml:space="preserve">Tag Book v1.3 (Politeness, multi-label) </w:t>
-      </w:r>
-    </w:p>
-    <w:p>
-      <w:pPr>
-        <w:rPr>
-          <w:rFonts w:ascii="Times New Roman" w:hAnsi="Times New Roman" w:cs="Times New Roman"/>
-          <w:b/>
-          <w:bCs/>
-          <w:sz w:val="24"/>
-          <w:szCs w:val="24"/>
-        </w:rPr>
-      </w:pPr>
-      <w:r>
-        <w:rPr>
-          <w:rFonts w:ascii="Times New Roman" w:hAnsi="Times New Roman" w:cs="Times New Roman"/>
-          <w:b/>
-          <w:bCs/>
-          <w:sz w:val="24"/>
-          <w:szCs w:val="24"/>
-        </w:rPr>
-        <w:t>Coding steps</w:t>
-      </w:r>
-    </w:p>
-    <w:p>
-      <w:pPr>
-        <w:numPr>
-          <w:ilvl w:val="0"/>
-          <w:numId w:val="2"/>
-        </w:numPr>
+        <w:pStyle w:val="Heading1"/>
         <w:rPr>
           <w:rFonts w:ascii="Times New Roman" w:hAnsi="Times New Roman" w:cs="Times New Roman"/>
           <w:sz w:val="24"/>
@@ -62,15 +17,20 @@
           <w:sz w:val="24"/>
           <w:szCs w:val="24"/>
         </w:rPr>
-        <w:t>Read the reply in reply_text.</w:t>
-      </w:r>
-    </w:p>
-    <w:p>
-      <w:pPr>
-        <w:numPr>
-          <w:ilvl w:val="0"/>
-          <w:numId w:val="2"/>
-        </w:numPr>
+        <w:t>Politeness Tagbook v1.1 (frozen)</w:t>
+      </w:r>
+    </w:p>
+    <w:p>
+      <w:pPr>
+        <w:pStyle w:val="NormalWeb"/>
+      </w:pPr>
+      <w:r>
+        <w:t xml:space="preserve">Scope: multi-label at reply level; keep brands masked (Chatbot A/B). Apply tags that truly fit; if none, use T06. Ignore quoted customer text unless agent adopts it. Precedence scan: Refusal → Apology → Empathy/Gratitude → Positive Flex → Mitigation/Hedge → General. Negation guard: “not/never/no” ≤3 tokens before “sorry/apologize/regret” cancels T02. (Based on v1 materials and label set.) </w:t>
+      </w:r>
+    </w:p>
+    <w:p>
+      <w:pPr>
+        <w:pStyle w:val="Heading2"/>
         <w:rPr>
           <w:rFonts w:ascii="Times New Roman" w:hAnsi="Times New Roman" w:cs="Times New Roman"/>
           <w:sz w:val="24"/>
@@ -83,15 +43,58 @@
           <w:sz w:val="24"/>
           <w:szCs w:val="24"/>
         </w:rPr>
-        <w:t>Check in this order: Refusal -&gt; Apology -&gt; Empathy/Gratitude -&gt; Positive Flex -&gt; Mitigation/Hedge -&gt; General.</w:t>
-      </w:r>
-    </w:p>
-    <w:p>
-      <w:pPr>
-        <w:numPr>
-          <w:ilvl w:val="0"/>
-          <w:numId w:val="2"/>
-        </w:numPr>
+        <w:t>T01_EmpathyGratitude</w:t>
+      </w:r>
+    </w:p>
+    <w:p>
+      <w:pPr>
+        <w:pStyle w:val="NormalWeb"/>
+      </w:pPr>
+      <w:r>
+        <w:rPr>
+          <w:rStyle w:val="Strong"/>
+          <w:rFonts w:eastAsiaTheme="majorEastAsia"/>
+        </w:rPr>
+        <w:t>Rule (1–2 lines):</w:t>
+      </w:r>
+      <w:r>
+        <w:t xml:space="preserve"> Expresses understanding or appreciation toward the user. Count “we/I understand/know/see/hear,” “thanks for…,” “we appreciate,” “we’re here to help.” </w:t>
+      </w:r>
+      <w:r>
+        <w:br/>
+      </w:r>
+      <w:r>
+        <w:rPr>
+          <w:rStyle w:val="Strong"/>
+          <w:rFonts w:eastAsiaTheme="majorEastAsia"/>
+        </w:rPr>
+        <w:t>Borderline:</w:t>
+      </w:r>
+      <w:r>
+        <w:t xml:space="preserve"> “Thanks for contacting us” alone → no tag. Pair with concrete help? add T03. </w:t>
+      </w:r>
+      <w:r>
+        <w:br/>
+      </w:r>
+      <w:r>
+        <w:rPr>
+          <w:rStyle w:val="Strong"/>
+          <w:rFonts w:eastAsiaTheme="majorEastAsia"/>
+        </w:rPr>
+        <w:t>Examples:</w:t>
+      </w:r>
+      <w:r>
+        <w:br/>
+        <w:t>• “We understand delays are frustrating—thanks for your patience.” (T01; +T03 if promising action)</w:t>
+      </w:r>
+      <w:r>
+        <w:br/>
+        <w:t>• “Thanks for contacting us.” (no T01)</w:t>
+      </w:r>
+    </w:p>
+    <w:p>
+      <w:pPr>
+        <w:pStyle w:val="Heading2"/>
         <w:rPr>
           <w:rFonts w:ascii="Times New Roman" w:hAnsi="Times New Roman" w:cs="Times New Roman"/>
           <w:sz w:val="24"/>
@@ -104,15 +107,58 @@
           <w:sz w:val="24"/>
           <w:szCs w:val="24"/>
         </w:rPr>
-        <w:t>Apply all tags that truly fit.</w:t>
-      </w:r>
-    </w:p>
-    <w:p>
-      <w:pPr>
-        <w:numPr>
-          <w:ilvl w:val="0"/>
-          <w:numId w:val="2"/>
-        </w:numPr>
+        <w:t>T02_Apology</w:t>
+      </w:r>
+    </w:p>
+    <w:p>
+      <w:pPr>
+        <w:pStyle w:val="NormalWeb"/>
+      </w:pPr>
+      <w:r>
+        <w:rPr>
+          <w:rStyle w:val="Strong"/>
+          <w:rFonts w:eastAsiaTheme="majorEastAsia"/>
+        </w:rPr>
+        <w:t>Rule:</w:t>
+      </w:r>
+      <w:r>
+        <w:t xml:space="preserve"> Unnegated regret/apology: “sorry,” “we apologize/our apologies,” “we regret,” “sorry to hear…”. Negation cancels (e.g., “I’m not sorry”). </w:t>
+      </w:r>
+      <w:r>
+        <w:br/>
+      </w:r>
+      <w:r>
+        <w:rPr>
+          <w:rStyle w:val="Strong"/>
+          <w:rFonts w:eastAsiaTheme="majorEastAsia"/>
+        </w:rPr>
+        <w:t>Borderline:</w:t>
+      </w:r>
+      <w:r>
+        <w:t xml:space="preserve"> Polite markers without regret (“please,” “kindly”) → not T02. If apology + refusal, co-tag T05.</w:t>
+      </w:r>
+      <w:r>
+        <w:br/>
+      </w:r>
+      <w:r>
+        <w:rPr>
+          <w:rStyle w:val="Strong"/>
+          <w:rFonts w:eastAsiaTheme="majorEastAsia"/>
+        </w:rPr>
+        <w:t>Examples:</w:t>
+      </w:r>
+      <w:r>
+        <w:br/>
+        <w:t>• “Sorry for the delay—we should have updated you sooner.” (T02)</w:t>
+      </w:r>
+      <w:r>
+        <w:br/>
+        <w:t>• “I’m not sorry about this policy.” (no T02)</w:t>
+      </w:r>
+    </w:p>
+    <w:p>
+      <w:pPr>
+        <w:pStyle w:val="Heading2"/>
         <w:rPr>
           <w:rFonts w:ascii="Times New Roman" w:hAnsi="Times New Roman" w:cs="Times New Roman"/>
           <w:sz w:val="24"/>
@@ -125,15 +171,58 @@
           <w:sz w:val="24"/>
           <w:szCs w:val="24"/>
         </w:rPr>
-        <w:t>If none fit, use T06_GeneralAnswer.</w:t>
-      </w:r>
-    </w:p>
-    <w:p>
-      <w:pPr>
-        <w:numPr>
-          <w:ilvl w:val="0"/>
-          <w:numId w:val="2"/>
-        </w:numPr>
+        <w:t>T03_PositiveFlex</w:t>
+      </w:r>
+    </w:p>
+    <w:p>
+      <w:pPr>
+        <w:pStyle w:val="NormalWeb"/>
+      </w:pPr>
+      <w:r>
+        <w:rPr>
+          <w:rStyle w:val="Strong"/>
+          <w:rFonts w:eastAsiaTheme="majorEastAsia"/>
+        </w:rPr>
+        <w:t>Rule:</w:t>
+      </w:r>
+      <w:r>
+        <w:t xml:space="preserve"> Commits agency/willingness to act for the user (check, arrange, expedite, update, issue, send, process, guide, prioritize). Future/ongoing commitments count. </w:t>
+      </w:r>
+      <w:r>
+        <w:br/>
+      </w:r>
+      <w:r>
+        <w:rPr>
+          <w:rStyle w:val="Strong"/>
+          <w:rFonts w:eastAsiaTheme="majorEastAsia"/>
+        </w:rPr>
+        <w:t>Borderline:</w:t>
+      </w:r>
+      <w:r>
+        <w:t xml:space="preserve"> Pure instructions with no agent action → T06/T04. If both agency + self-serve/conditional, add T04.</w:t>
+      </w:r>
+      <w:r>
+        <w:br/>
+      </w:r>
+      <w:r>
+        <w:rPr>
+          <w:rStyle w:val="Strong"/>
+          <w:rFonts w:eastAsiaTheme="majorEastAsia"/>
+        </w:rPr>
+        <w:t>Examples:</w:t>
+      </w:r>
+      <w:r>
+        <w:br/>
+        <w:t>• “I’ll look into logistics and keep you updated.” (T03)</w:t>
+      </w:r>
+      <w:r>
+        <w:br/>
+        <w:t>• “Open Your Orders and select the item.” (no T03)</w:t>
+      </w:r>
+    </w:p>
+    <w:p>
+      <w:pPr>
+        <w:pStyle w:val="Heading2"/>
         <w:rPr>
           <w:rFonts w:ascii="Times New Roman" w:hAnsi="Times New Roman" w:cs="Times New Roman"/>
           <w:sz w:val="24"/>
@@ -146,15 +235,62 @@
           <w:sz w:val="24"/>
           <w:szCs w:val="24"/>
         </w:rPr>
-        <w:t>Ignore quoted customer text unless the agent adopts it.</w:t>
-      </w:r>
-    </w:p>
-    <w:p>
-      <w:pPr>
-        <w:numPr>
-          <w:ilvl w:val="0"/>
-          <w:numId w:val="2"/>
-        </w:numPr>
+        <w:t>T04_MitigationHedge</w:t>
+      </w:r>
+    </w:p>
+    <w:p>
+      <w:pPr>
+        <w:pStyle w:val="NormalWeb"/>
+      </w:pPr>
+      <w:r>
+        <w:rPr>
+          <w:rStyle w:val="Strong"/>
+          <w:rFonts w:eastAsiaTheme="majorEastAsia"/>
+        </w:rPr>
+        <w:t>Rule:</w:t>
+      </w:r>
+      <w:r>
+        <w:t xml:space="preserve"> Softens/qualifies or deflects to self-service or conditional UI: “may/might/usually/typically/generally/likely,” “it seems/looks,” “unfortunately,” “at this time/for now,” “if available/you’ll see,” imperative to Help Center/Your Orders as deflection. Prefer T04 over T06 when conditional/deflective phrasing appears. Co-tag with T03 if </w:t>
+      </w:r>
+      <w:r>
+        <w:lastRenderedPageBreak/>
+        <w:t xml:space="preserve">committing action too. </w:t>
+      </w:r>
+      <w:r>
+        <w:br/>
+      </w:r>
+      <w:r>
+        <w:rPr>
+          <w:rStyle w:val="Strong"/>
+          <w:rFonts w:eastAsiaTheme="majorEastAsia"/>
+        </w:rPr>
+        <w:t>Borderline:</w:t>
+      </w:r>
+      <w:r>
+        <w:t xml:space="preserve"> Neutral, unconditional procedure with no hedging → T06.</w:t>
+      </w:r>
+      <w:r>
+        <w:br/>
+      </w:r>
+      <w:r>
+        <w:rPr>
+          <w:rStyle w:val="Strong"/>
+          <w:rFonts w:eastAsiaTheme="majorEastAsia"/>
+        </w:rPr>
+        <w:t>Examples:</w:t>
+      </w:r>
+      <w:r>
+        <w:br/>
+        <w:t>• “If available, choose Change delivery… some shipments can’t be changed.” (T04)</w:t>
+      </w:r>
+      <w:r>
+        <w:br/>
+        <w:t>• “Please check the product page for options.” (T04)</w:t>
+      </w:r>
+    </w:p>
+    <w:p>
+      <w:pPr>
+        <w:pStyle w:val="Heading2"/>
         <w:rPr>
           <w:rFonts w:ascii="Times New Roman" w:hAnsi="Times New Roman" w:cs="Times New Roman"/>
           <w:sz w:val="24"/>
@@ -167,15 +303,58 @@
           <w:sz w:val="24"/>
           <w:szCs w:val="24"/>
         </w:rPr>
-        <w:t>Keep brands masked (Chatbot A/B).</w:t>
-      </w:r>
-    </w:p>
-    <w:p>
-      <w:pPr>
-        <w:numPr>
-          <w:ilvl w:val="0"/>
-          <w:numId w:val="2"/>
-        </w:numPr>
+        <w:t>T05_RefusalMinus</w:t>
+      </w:r>
+    </w:p>
+    <w:p>
+      <w:pPr>
+        <w:pStyle w:val="NormalWeb"/>
+      </w:pPr>
+      <w:r>
+        <w:rPr>
+          <w:rStyle w:val="Strong"/>
+          <w:rFonts w:eastAsiaTheme="majorEastAsia"/>
+        </w:rPr>
+        <w:t>Rule:</w:t>
+      </w:r>
+      <w:r>
+        <w:t xml:space="preserve"> States inability/denial due to policy/constraints: “can’t/cannot/unable,” “not allowed/eligible,” “won’t be able to,” “outside window.” Add T02 if apologizing; add T04 if hedged (“unfortunately”). </w:t>
+      </w:r>
+      <w:r>
+        <w:br/>
+      </w:r>
+      <w:r>
+        <w:rPr>
+          <w:rStyle w:val="Strong"/>
+          <w:rFonts w:eastAsiaTheme="majorEastAsia"/>
+        </w:rPr>
+        <w:t>Borderline:</w:t>
+      </w:r>
+      <w:r>
+        <w:t xml:space="preserve"> Suggesting alternatives without explicit denial → T04/T06.</w:t>
+      </w:r>
+      <w:r>
+        <w:br/>
+      </w:r>
+      <w:r>
+        <w:rPr>
+          <w:rStyle w:val="Strong"/>
+          <w:rFonts w:eastAsiaTheme="majorEastAsia"/>
+        </w:rPr>
+        <w:t>Examples:</w:t>
+      </w:r>
+      <w:r>
+        <w:br/>
+        <w:t>• “We can’t cancel after dispatch due to carrier policy.” (T05)</w:t>
+      </w:r>
+      <w:r>
+        <w:br/>
+        <w:t>• “Payment methods can’t be changed after placing the order.” (T05)</w:t>
+      </w:r>
+    </w:p>
+    <w:p>
+      <w:pPr>
+        <w:pStyle w:val="Heading2"/>
         <w:rPr>
           <w:rFonts w:ascii="Times New Roman" w:hAnsi="Times New Roman" w:cs="Times New Roman"/>
           <w:sz w:val="24"/>
@@ -188,11 +367,58 @@
           <w:sz w:val="24"/>
           <w:szCs w:val="24"/>
         </w:rPr>
-        <w:t>Negation guard: “not/never/no” within 3 words before “sorry/apologize/regret” cancels T02.</w:t>
-      </w:r>
-    </w:p>
-    <w:p>
-      <w:pPr>
+        <w:t>T06_GeneralAnswer</w:t>
+      </w:r>
+    </w:p>
+    <w:p>
+      <w:pPr>
+        <w:pStyle w:val="NormalWeb"/>
+      </w:pPr>
+      <w:r>
+        <w:rPr>
+          <w:rStyle w:val="Strong"/>
+          <w:rFonts w:eastAsiaTheme="majorEastAsia"/>
+        </w:rPr>
+        <w:t>Rule:</w:t>
+      </w:r>
+      <w:r>
+        <w:t xml:space="preserve"> Purely informational/procedural; none of T01–T05 present. Prefer T04 over T06 when any conditional/deflective phrasing appears. </w:t>
+      </w:r>
+      <w:r>
+        <w:br/>
+      </w:r>
+      <w:r>
+        <w:rPr>
+          <w:rStyle w:val="Strong"/>
+          <w:rFonts w:eastAsiaTheme="majorEastAsia"/>
+        </w:rPr>
+        <w:t>Borderline:</w:t>
+      </w:r>
+      <w:r>
+        <w:t xml:space="preserve"> Imperatives to app flows count as T06 only when unconditional and not hedged (e.g., “Open Your Orders…”). If “if available/you’ll see,” switch to T04.</w:t>
+      </w:r>
+      <w:r>
+        <w:br/>
+      </w:r>
+      <w:r>
+        <w:rPr>
+          <w:rStyle w:val="Strong"/>
+          <w:rFonts w:eastAsiaTheme="majorEastAsia"/>
+        </w:rPr>
+        <w:t>Examples:</w:t>
+      </w:r>
+      <w:r>
+        <w:br/>
+        <w:t>• “Open Your Orders and choose ‘Problem with order.’” (T06)</w:t>
+      </w:r>
+      <w:r>
+        <w:br/>
+        <w:t>• “Track your order in Your Orders for the latest estimate.” (T06)</w:t>
+      </w:r>
+    </w:p>
+    <w:p>
+      <w:pPr>
+        <w:pStyle w:val="Heading3"/>
         <w:rPr>
           <w:rFonts w:ascii="Times New Roman" w:hAnsi="Times New Roman" w:cs="Times New Roman"/>
           <w:sz w:val="24"/>
@@ -202,432 +428,194 @@
       <w:r>
         <w:rPr>
           <w:rFonts w:ascii="Times New Roman" w:hAnsi="Times New Roman" w:cs="Times New Roman"/>
-          <w:b/>
-          <w:bCs/>
           <w:sz w:val="24"/>
           <w:szCs w:val="24"/>
         </w:rPr>
-        <w:t>T01_EmpathyGratitude</w:t>
-      </w:r>
-      <w:r>
+        <w:t>Co-tagging quick rules</w:t>
+      </w:r>
+    </w:p>
+    <w:p>
+      <w:pPr>
+        <w:pStyle w:val="NormalWeb"/>
+        <w:numPr>
+          <w:ilvl w:val="0"/>
+          <w:numId w:val="3"/>
+        </w:numPr>
+      </w:pPr>
+      <w:r>
+        <w:t>T01 + T02 often co-occur; add both when present.</w:t>
+      </w:r>
+    </w:p>
+    <w:p>
+      <w:pPr>
+        <w:pStyle w:val="NormalWeb"/>
+        <w:numPr>
+          <w:ilvl w:val="0"/>
+          <w:numId w:val="3"/>
+        </w:numPr>
+      </w:pPr>
+      <w:r>
+        <w:t>T03 + T04: add both when reply both commits action and uses hedging/deflection.</w:t>
+      </w:r>
+    </w:p>
+    <w:p>
+      <w:pPr>
+        <w:pStyle w:val="NormalWeb"/>
+        <w:numPr>
+          <w:ilvl w:val="0"/>
+          <w:numId w:val="3"/>
+        </w:numPr>
+      </w:pPr>
+      <w:r>
+        <w:t>T05 with T02/T04: refusal + apology and/or hedge → co-tag.</w:t>
+      </w:r>
+    </w:p>
+    <w:p>
+      <w:pPr>
+        <w:pStyle w:val="NormalWeb"/>
+        <w:numPr>
+          <w:ilvl w:val="0"/>
+          <w:numId w:val="3"/>
+        </w:numPr>
+      </w:pPr>
+      <w:r>
+        <w:t xml:space="preserve">T06 stands alone only when no other tag fits. </w:t>
+      </w:r>
+    </w:p>
+    <w:p>
+      <w:pPr>
+        <w:pStyle w:val="Heading3"/>
         <w:rPr>
           <w:rFonts w:ascii="Times New Roman" w:hAnsi="Times New Roman" w:cs="Times New Roman"/>
           <w:sz w:val="24"/>
           <w:szCs w:val="24"/>
         </w:rPr>
-        <w:br/>
-        <w:t>Rule Shows understanding or appreciation toward the user.</w:t>
-      </w:r>
+      </w:pPr>
       <w:r>
         <w:rPr>
           <w:rFonts w:ascii="Times New Roman" w:hAnsi="Times New Roman" w:cs="Times New Roman"/>
           <w:sz w:val="24"/>
           <w:szCs w:val="24"/>
         </w:rPr>
-        <w:br/>
-        <w:t>Include when we/I understand, we/I know this is, I get/see/hear, thank you for your patience/details, we appreciate, we are here to help.</w:t>
-      </w:r>
-      <w:r>
+        <w:t>Taxonomy corrections (freeze)</w:t>
+      </w:r>
+    </w:p>
+    <w:p>
+      <w:pPr>
+        <w:pStyle w:val="NormalWeb"/>
+        <w:numPr>
+          <w:ilvl w:val="0"/>
+          <w:numId w:val="4"/>
+        </w:numPr>
+      </w:pPr>
+      <w:r>
+        <w:t xml:space="preserve">Do </w:t>
+      </w:r>
+      <w:r>
+        <w:rPr>
+          <w:rStyle w:val="Strong"/>
+          <w:rFonts w:eastAsiaTheme="majorEastAsia"/>
+        </w:rPr>
+        <w:t>not</w:t>
+      </w:r>
+      <w:r>
+        <w:t xml:space="preserve"> use nonstandard labels seen in drafts (e.g., “T05_GuidancePolicy,” “T06_RefusalMinus”). Map guidance-only to T06 (unconditional) or T04 (conditional/deflective); refusals to T05. (Harmonizes labels with config.) </w:t>
+      </w:r>
+    </w:p>
+    <w:p>
+      <w:pPr>
+        <w:pStyle w:val="Heading3"/>
         <w:rPr>
           <w:rFonts w:ascii="Times New Roman" w:hAnsi="Times New Roman" w:cs="Times New Roman"/>
           <w:sz w:val="24"/>
           <w:szCs w:val="24"/>
         </w:rPr>
-        <w:br/>
-        <w:t>Borderline “Thanks for contacting us” alone is not T01.</w:t>
-      </w:r>
+      </w:pPr>
       <w:r>
         <w:rPr>
           <w:rFonts w:ascii="Times New Roman" w:hAnsi="Times New Roman" w:cs="Times New Roman"/>
           <w:sz w:val="24"/>
           <w:szCs w:val="24"/>
         </w:rPr>
+        <w:t>Minimal borderline set (grounded by study replies)</w:t>
+      </w:r>
+    </w:p>
+    <w:p>
+      <w:pPr>
+        <w:pStyle w:val="NormalWeb"/>
+        <w:numPr>
+          <w:ilvl w:val="0"/>
+          <w:numId w:val="5"/>
+        </w:numPr>
+      </w:pPr>
+      <w:r>
+        <w:t xml:space="preserve">“We understand you haven’t received your package… Select order…” → T01 + T06/T04 (T04 if framed as deflection/conditional). </w:t>
+      </w:r>
+    </w:p>
+    <w:p>
+      <w:pPr>
+        <w:pStyle w:val="NormalWeb"/>
+        <w:numPr>
+          <w:ilvl w:val="0"/>
+          <w:numId w:val="5"/>
+        </w:numPr>
+      </w:pPr>
+      <w:r>
+        <w:t xml:space="preserve">“We’re sorry about the mix-up… we’ll guide you…” → T02 + T03 (and T06/T04 based on phrasing). </w:t>
+      </w:r>
+    </w:p>
+    <w:p>
+      <w:pPr>
+        <w:pStyle w:val="NormalWeb"/>
+        <w:numPr>
+          <w:ilvl w:val="0"/>
+          <w:numId w:val="5"/>
+        </w:numPr>
+      </w:pPr>
+      <w:r>
+        <w:t xml:space="preserve">“If upgrade options are available, you’ll see them at checkout.” → T04 (not T06). </w:t>
+      </w:r>
+    </w:p>
+    <w:p>
+      <w:pPr>
+        <w:pStyle w:val="NormalWeb"/>
+        <w:numPr>
+          <w:ilvl w:val="0"/>
+          <w:numId w:val="5"/>
+        </w:numPr>
+      </w:pPr>
+      <w:r>
+        <w:lastRenderedPageBreak/>
+        <w:t xml:space="preserve">“You can cancel from Your Orders if the item hasn’t entered shipping.” → T06 (no hedge); becomes T04 if “if available/typically.” </w:t>
+      </w:r>
+    </w:p>
+    <w:p>
+      <w:pPr>
+        <w:pStyle w:val="NormalWeb"/>
+        <w:numPr>
+          <w:ilvl w:val="0"/>
+          <w:numId w:val="5"/>
+        </w:numPr>
+      </w:pPr>
+      <w:r>
+        <w:t xml:space="preserve">“I’m afraid I can’t respond to that request.” → T05 (add T02 only if apologizing). </w:t>
+      </w:r>
+    </w:p>
+    <w:p>
+      <w:pPr>
+        <w:pStyle w:val="NormalWeb"/>
+      </w:pPr>
+      <w:r>
+        <w:rPr>
+          <w:rStyle w:val="Strong"/>
+          <w:rFonts w:eastAsiaTheme="majorEastAsia"/>
+        </w:rPr>
+        <w:t>Frozen label set (must match tooling):</w:t>
+      </w:r>
+      <w:r>
         <w:br/>
-        <w:t>Example “We understand delays are frustrating. Thanks for your patience.”</w:t>
-      </w:r>
-    </w:p>
-    <w:p>
-      <w:pPr>
-        <w:rPr>
-          <w:rFonts w:ascii="Times New Roman" w:hAnsi="Times New Roman" w:cs="Times New Roman"/>
-          <w:sz w:val="24"/>
-          <w:szCs w:val="24"/>
-        </w:rPr>
-      </w:pPr>
-      <w:r>
-        <w:rPr>
-          <w:rFonts w:ascii="Times New Roman" w:hAnsi="Times New Roman" w:cs="Times New Roman"/>
-          <w:b/>
-          <w:bCs/>
-          <w:sz w:val="24"/>
-          <w:szCs w:val="24"/>
-        </w:rPr>
-        <w:t>T02_Apology</w:t>
-      </w:r>
-      <w:r>
-        <w:rPr>
-          <w:rFonts w:ascii="Times New Roman" w:hAnsi="Times New Roman" w:cs="Times New Roman"/>
-          <w:sz w:val="24"/>
-          <w:szCs w:val="24"/>
-        </w:rPr>
-        <w:br/>
-        <w:t>Rule Expresses regret or apology (not negated).</w:t>
-      </w:r>
-      <w:r>
-        <w:rPr>
-          <w:rFonts w:ascii="Times New Roman" w:hAnsi="Times New Roman" w:cs="Times New Roman"/>
-          <w:sz w:val="24"/>
-          <w:szCs w:val="24"/>
-        </w:rPr>
-        <w:br/>
-        <w:t>Include when sorry, we apologize/our apologies, we regret, sorry to hear.</w:t>
-      </w:r>
-      <w:r>
-        <w:rPr>
-          <w:rFonts w:ascii="Times New Roman" w:hAnsi="Times New Roman" w:cs="Times New Roman"/>
-          <w:sz w:val="24"/>
-          <w:szCs w:val="24"/>
-        </w:rPr>
-        <w:br/>
-        <w:t>Exclude “I’m not sorry about this policy.”</w:t>
-      </w:r>
-      <w:r>
-        <w:rPr>
-          <w:rFonts w:ascii="Times New Roman" w:hAnsi="Times New Roman" w:cs="Times New Roman"/>
-          <w:sz w:val="24"/>
-          <w:szCs w:val="24"/>
-        </w:rPr>
-        <w:br/>
-        <w:t>Example “Sorry for the delay—we should have updated you sooner.”</w:t>
-      </w:r>
-    </w:p>
-    <w:p>
-      <w:pPr>
-        <w:rPr>
-          <w:rFonts w:ascii="Times New Roman" w:hAnsi="Times New Roman" w:cs="Times New Roman"/>
-          <w:sz w:val="24"/>
-          <w:szCs w:val="24"/>
-        </w:rPr>
-      </w:pPr>
-      <w:r>
-        <w:rPr>
-          <w:rFonts w:ascii="Times New Roman" w:hAnsi="Times New Roman" w:cs="Times New Roman"/>
-          <w:b/>
-          <w:bCs/>
-          <w:sz w:val="24"/>
-          <w:szCs w:val="24"/>
-        </w:rPr>
-        <w:t>T03_PositiveFlex</w:t>
-      </w:r>
-      <w:r>
-        <w:rPr>
-          <w:rFonts w:ascii="Times New Roman" w:hAnsi="Times New Roman" w:cs="Times New Roman"/>
-          <w:sz w:val="24"/>
-          <w:szCs w:val="24"/>
-        </w:rPr>
-        <w:br/>
-        <w:t>Rule Shows willingness or concrete agency to help.</w:t>
-      </w:r>
-      <w:r>
-        <w:rPr>
-          <w:rFonts w:ascii="Times New Roman" w:hAnsi="Times New Roman" w:cs="Times New Roman"/>
-          <w:sz w:val="24"/>
-          <w:szCs w:val="24"/>
-        </w:rPr>
-        <w:br/>
-        <w:t>Include when let me check/arrange, I/We will update/confirm/review/verify, we can issue a refund/send a replacement, I’ll help you return it, expedite/fast-track/prioritize, guide you through, provide a label, arrange pickup, process a refund.</w:t>
-      </w:r>
-      <w:r>
-        <w:rPr>
-          <w:rFonts w:ascii="Times New Roman" w:hAnsi="Times New Roman" w:cs="Times New Roman"/>
-          <w:sz w:val="24"/>
-          <w:szCs w:val="24"/>
-        </w:rPr>
-        <w:br/>
-        <w:t>Borderline Pure instructions with no agent action are not T03.</w:t>
-      </w:r>
-    </w:p>
-    <w:p>
-      <w:pPr>
-        <w:rPr>
-          <w:rFonts w:ascii="Times New Roman" w:hAnsi="Times New Roman" w:cs="Times New Roman"/>
-          <w:sz w:val="24"/>
-          <w:szCs w:val="24"/>
-        </w:rPr>
-      </w:pPr>
-      <w:r>
-        <w:rPr>
-          <w:rFonts w:ascii="Times New Roman" w:hAnsi="Times New Roman" w:cs="Times New Roman"/>
-          <w:b/>
-          <w:bCs/>
-          <w:sz w:val="24"/>
-          <w:szCs w:val="24"/>
-        </w:rPr>
-        <w:t>T04_MitigationHedge</w:t>
-      </w:r>
-      <w:r>
-        <w:rPr>
-          <w:rFonts w:ascii="Times New Roman" w:hAnsi="Times New Roman" w:cs="Times New Roman"/>
-          <w:sz w:val="24"/>
-          <w:szCs w:val="24"/>
-        </w:rPr>
-        <w:br/>
-        <w:t>Rule Softens or qualifies or deflects to self-serve.</w:t>
-      </w:r>
-      <w:r>
-        <w:rPr>
-          <w:rFonts w:ascii="Times New Roman" w:hAnsi="Times New Roman" w:cs="Times New Roman"/>
-          <w:sz w:val="24"/>
-          <w:szCs w:val="24"/>
-        </w:rPr>
-        <w:br/>
-        <w:t xml:space="preserve">Include when maybe/might/may/could/usually/typically/generally/likely, it seems/looks/appears, unfortunately, at this time/for now/in most cases/should be able to, conditional UI like “If available you’ll see it at checkout,” deflection like “please check the website/Help Center/Your </w:t>
-      </w:r>
-      <w:r>
-        <w:rPr>
-          <w:rFonts w:ascii="Times New Roman" w:hAnsi="Times New Roman" w:cs="Times New Roman"/>
-          <w:sz w:val="24"/>
-          <w:szCs w:val="24"/>
-        </w:rPr>
-        <w:lastRenderedPageBreak/>
-        <w:t>Orders,” try again later, subject to availability, imperative UI + self-service location (open/select/click/tap -&gt; Your Orders/Help Center/etc.).</w:t>
-      </w:r>
-      <w:r>
-        <w:rPr>
-          <w:rFonts w:ascii="Times New Roman" w:hAnsi="Times New Roman" w:cs="Times New Roman"/>
-          <w:sz w:val="24"/>
-          <w:szCs w:val="24"/>
-        </w:rPr>
-        <w:br/>
-        <w:t>Co-tag If the reply also commits to action (“I’ll update you”), add T03 as well.</w:t>
-      </w:r>
-    </w:p>
-    <w:p>
-      <w:pPr>
-        <w:rPr>
-          <w:rFonts w:ascii="Times New Roman" w:hAnsi="Times New Roman" w:cs="Times New Roman"/>
-          <w:sz w:val="24"/>
-          <w:szCs w:val="24"/>
-        </w:rPr>
-      </w:pPr>
-      <w:r>
-        <w:rPr>
-          <w:rFonts w:ascii="Times New Roman" w:hAnsi="Times New Roman" w:cs="Times New Roman"/>
-          <w:b/>
-          <w:bCs/>
-          <w:sz w:val="24"/>
-          <w:szCs w:val="24"/>
-        </w:rPr>
-        <w:t>T05_RefusalMinus</w:t>
-      </w:r>
-      <w:r>
-        <w:rPr>
-          <w:rFonts w:ascii="Times New Roman" w:hAnsi="Times New Roman" w:cs="Times New Roman"/>
-          <w:sz w:val="24"/>
-          <w:szCs w:val="24"/>
-        </w:rPr>
-        <w:br/>
-        <w:t>Rule Denies or states inability due to policy or constraints.</w:t>
-      </w:r>
-      <w:r>
-        <w:rPr>
-          <w:rFonts w:ascii="Times New Roman" w:hAnsi="Times New Roman" w:cs="Times New Roman"/>
-          <w:sz w:val="24"/>
-          <w:szCs w:val="24"/>
-        </w:rPr>
-        <w:br/>
-        <w:t>Include when can’t/cannot/unable, not allowed, won’t be able to, policy prohibits/does not allow, not eligible/outside return window, cannot accept/process/change/refund/cancel.</w:t>
-      </w:r>
-      <w:r>
-        <w:rPr>
-          <w:rFonts w:ascii="Times New Roman" w:hAnsi="Times New Roman" w:cs="Times New Roman"/>
-          <w:sz w:val="24"/>
-          <w:szCs w:val="24"/>
-        </w:rPr>
-        <w:br/>
-        <w:t>Example “We can’t cancel after dispatch due to carrier policy.”</w:t>
-      </w:r>
-      <w:r>
-        <w:rPr>
-          <w:rFonts w:ascii="Times New Roman" w:hAnsi="Times New Roman" w:cs="Times New Roman"/>
-          <w:sz w:val="24"/>
-          <w:szCs w:val="24"/>
-        </w:rPr>
-        <w:br/>
-        <w:t>Co-tags Add T02 if apologizing; add T04 if hedging (“unfortunately”).</w:t>
-      </w:r>
-    </w:p>
-    <w:p>
-      <w:pPr>
-        <w:rPr>
-          <w:rFonts w:ascii="Times New Roman" w:hAnsi="Times New Roman" w:cs="Times New Roman"/>
-          <w:sz w:val="24"/>
-          <w:szCs w:val="24"/>
-        </w:rPr>
-      </w:pPr>
-      <w:r>
-        <w:rPr>
-          <w:rFonts w:ascii="Times New Roman" w:hAnsi="Times New Roman" w:cs="Times New Roman"/>
-          <w:b/>
-          <w:bCs/>
-          <w:sz w:val="24"/>
-          <w:szCs w:val="24"/>
-        </w:rPr>
-        <w:t>T06_GeneralAnswer</w:t>
-      </w:r>
-      <w:r>
-        <w:rPr>
-          <w:rFonts w:ascii="Times New Roman" w:hAnsi="Times New Roman" w:cs="Times New Roman"/>
-          <w:sz w:val="24"/>
-          <w:szCs w:val="24"/>
-        </w:rPr>
-        <w:br/>
-        <w:t>Rule Informational or procedural with none of T01 to T05.</w:t>
-      </w:r>
-      <w:r>
-        <w:rPr>
-          <w:rFonts w:ascii="Times New Roman" w:hAnsi="Times New Roman" w:cs="Times New Roman"/>
-          <w:sz w:val="24"/>
-          <w:szCs w:val="24"/>
-        </w:rPr>
-        <w:br/>
-        <w:t>Include when neutral facts, timelines, or steps without empathy/apology/agency/hedge/refusal.</w:t>
-      </w:r>
-      <w:r>
-        <w:rPr>
-          <w:rFonts w:ascii="Times New Roman" w:hAnsi="Times New Roman" w:cs="Times New Roman"/>
-          <w:sz w:val="24"/>
-          <w:szCs w:val="24"/>
-        </w:rPr>
-        <w:br/>
-        <w:t>Prefer T04 over T06 when conditional or deflective phrasing is present.</w:t>
-      </w:r>
-    </w:p>
-    <w:p>
-      <w:pPr>
-        <w:rPr>
-          <w:rFonts w:ascii="Times New Roman" w:hAnsi="Times New Roman" w:cs="Times New Roman"/>
-          <w:sz w:val="24"/>
-          <w:szCs w:val="24"/>
-        </w:rPr>
-      </w:pPr>
-      <w:r>
-        <w:rPr>
-          <w:rFonts w:ascii="Times New Roman" w:hAnsi="Times New Roman" w:cs="Times New Roman"/>
-          <w:b/>
-          <w:bCs/>
-          <w:sz w:val="24"/>
-          <w:szCs w:val="24"/>
-        </w:rPr>
-        <w:t>Minimal pairs</w:t>
-      </w:r>
-      <w:r>
-        <w:rPr>
-          <w:rFonts w:ascii="Times New Roman" w:hAnsi="Times New Roman" w:cs="Times New Roman"/>
-          <w:sz w:val="24"/>
-          <w:szCs w:val="24"/>
-        </w:rPr>
-        <w:br/>
-        <w:t>“We understand this is frustrating.” -&gt; T01</w:t>
-      </w:r>
-      <w:r>
-        <w:rPr>
-          <w:rFonts w:ascii="Times New Roman" w:hAnsi="Times New Roman" w:cs="Times New Roman"/>
-          <w:sz w:val="24"/>
-          <w:szCs w:val="24"/>
-        </w:rPr>
-        <w:br/>
-        <w:t>“Sorry for the delay.” -&gt; T02</w:t>
-      </w:r>
-      <w:r>
-        <w:rPr>
-          <w:rFonts w:ascii="Times New Roman" w:hAnsi="Times New Roman" w:cs="Times New Roman"/>
-          <w:sz w:val="24"/>
-          <w:szCs w:val="24"/>
-        </w:rPr>
-        <w:br/>
-        <w:t>“I’ll check now and update you.” -&gt; T03</w:t>
-      </w:r>
-      <w:r>
-        <w:rPr>
-          <w:rFonts w:ascii="Times New Roman" w:hAnsi="Times New Roman" w:cs="Times New Roman"/>
-          <w:sz w:val="24"/>
-          <w:szCs w:val="24"/>
-        </w:rPr>
-        <w:br/>
-        <w:t>“If the option is available, you’ll see it at checkout.” -&gt; T04</w:t>
-      </w:r>
-      <w:r>
-        <w:rPr>
-          <w:rFonts w:ascii="Times New Roman" w:hAnsi="Times New Roman" w:cs="Times New Roman"/>
-          <w:sz w:val="24"/>
-          <w:szCs w:val="24"/>
-        </w:rPr>
-        <w:br/>
-        <w:t>“We can’t cancel after dispatch.” -&gt; T05</w:t>
-      </w:r>
-      <w:r>
-        <w:rPr>
-          <w:rFonts w:ascii="Times New Roman" w:hAnsi="Times New Roman" w:cs="Times New Roman"/>
-          <w:sz w:val="24"/>
-          <w:szCs w:val="24"/>
-        </w:rPr>
-        <w:br/>
-        <w:t>“Open Your Orders and select the item.” -&gt; T06</w:t>
-      </w:r>
-    </w:p>
-    <w:p>
-      <w:pPr>
-        <w:rPr>
-          <w:rFonts w:ascii="Times New Roman" w:hAnsi="Times New Roman" w:cs="Times New Roman"/>
-          <w:sz w:val="24"/>
-          <w:szCs w:val="24"/>
-        </w:rPr>
-      </w:pPr>
-      <w:r>
-        <w:rPr>
-          <w:rFonts w:ascii="Times New Roman" w:hAnsi="Times New Roman" w:cs="Times New Roman"/>
-          <w:sz w:val="24"/>
-          <w:szCs w:val="24"/>
-        </w:rPr>
-        <w:t>Label Studio config explained</w:t>
-      </w:r>
-      <w:r>
-        <w:rPr>
-          <w:rFonts w:ascii="Times New Roman" w:hAnsi="Times New Roman" w:cs="Times New Roman"/>
-          <w:sz w:val="24"/>
-          <w:szCs w:val="24"/>
-        </w:rPr>
-        <w:br/>
-        <w:t>shows the reply.</w:t>
-      </w:r>
-      <w:r>
-        <w:rPr>
-          <w:rFonts w:ascii="Times New Roman" w:hAnsi="Times New Roman" w:cs="Times New Roman"/>
-          <w:sz w:val="24"/>
-          <w:szCs w:val="24"/>
-        </w:rPr>
-        <w:br/>
-        <w:t>lets you select more than one label.</w:t>
-      </w:r>
-      <w:r>
-        <w:rPr>
-          <w:rFonts w:ascii="Times New Roman" w:hAnsi="Times New Roman" w:cs="Times New Roman"/>
-          <w:sz w:val="24"/>
-          <w:szCs w:val="24"/>
-        </w:rPr>
-        <w:br/>
-        <w:t>Available labels T01_EmpathyGratitude T02_Apology T03_PositiveFlex T04_MitigationHedge T05_RefusalMinus T06_GeneralAnswer.</w:t>
-      </w:r>
-    </w:p>
-    <w:p>
-      <w:pPr>
-        <w:rPr>
-          <w:rFonts w:ascii="Times New Roman" w:hAnsi="Times New Roman" w:cs="Times New Roman"/>
-          <w:sz w:val="24"/>
-          <w:szCs w:val="24"/>
-        </w:rPr>
-      </w:pPr>
+        <w:t>T01_EmpathyGratitude; T02_Apology; T03_PositiveFlex; T04_MitigationHedge; T05_RefusalMinus; T06_GeneralAnswer.</w:t>
+      </w:r>
     </w:p>
     <w:sectPr>
       <w:pgSz w:w="12240" w:h="15840"/>
@@ -640,7 +628,7 @@
 </file>
 
 <file path=word/numbering.xml><?xml version="1.0" encoding="utf-8"?>
-<w:numbering xmlns:wpc="http://schemas.microsoft.com/office/word/2010/wordprocessingCanvas" xmlns:cx="http://schemas.microsoft.com/office/drawing/2014/chartex" xmlns:cx1="http://schemas.microsoft.com/office/drawing/2015/9/8/chartex" xmlns:cx2="http://schemas.microsoft.com/office/drawing/2015/10/21/chartex" xmlns:cx3="http://schemas.microsoft.com/office/drawing/2016/5/9/chartex" xmlns:cx4="http://schemas.microsoft.com/office/drawing/2016/5/10/chartex" xmlns:cx5="http://schemas.microsoft.com/office/drawing/2016/5/11/chartex" xmlns:cx6="http://schemas.microsoft.com/office/drawing/2016/5/12/chartex" xmlns:cx7="http://schemas.microsoft.com/office/drawing/2016/5/13/chartex" xmlns:cx8="http://schemas.microsoft.com/office/drawing/2016/5/14/chartex" xmlns:mc="http://schemas.openxmlformats.org/markup-compatibility/2006" xmlns:aink="http://schemas.microsoft.com/office/drawing/2016/ink" xmlns:am3d="http://schemas.microsoft.com/office/drawing/2017/model3d" xmlns:o="urn:schemas-microsoft-com:office:office" xmlns:oel="http://schemas.microsoft.com/office/2019/extlst" xmlns:r="http://schemas.openxmlformats.org/officeDocument/2006/relationships" xmlns:m="http://schemas.openxmlformats.org/officeDocument/2006/math" xmlns:v="urn:schemas-microsoft-com:vml" xmlns:wp14="http://schemas.microsoft.com/office/word/2010/wordprocessingDrawing" xmlns:wp="http://schemas.openxmlformats.org/drawingml/2006/wordprocessingDrawing" xmlns:w10="urn:schemas-microsoft-com:office:word" xmlns:w="http://schemas.openxmlformats.org/wordprocessingml/2006/main" xmlns:w14="http://schemas.microsoft.com/office/word/2010/wordml" xmlns:w15="http://schemas.microsoft.com/office/word/2012/wordml" xmlns:w16cex="http://schemas.microsoft.com/office/word/2018/wordml/cex" xmlns:w16cid="http://schemas.microsoft.com/office/word/2016/wordml/cid" xmlns:w16="http://schemas.microsoft.com/office/word/2018/wordml" xmlns:w16du="http://schemas.microsoft.com/office/word/2023/wordml/word16du" xmlns:w16sdtdh="http://schemas.microsoft.com/office/word/2020/wordml/sdtdatahash" xmlns:w16sdtfl="http://schemas.microsoft.com/office/word/2024/wordml/sdtformatlock" xmlns:w16se="http://schemas.microsoft.com/office/word/2015/wordml/symex" xmlns:wpg="http://schemas.microsoft.com/office/word/2010/wordprocessingGroup" xmlns:wpi="http://schemas.microsoft.com/office/word/2010/wordprocessingInk" xmlns:wne="http://schemas.microsoft.com/office/word/2006/wordml" xmlns:wps="http://schemas.microsoft.com/office/word/2010/wordprocessingShape" mc:Ignorable="w14 w15 w16se w16cid w16 w16cex w16sdtdh w16sdtfl w16du wp14">
+<w:numbering xmlns:wpc="http://schemas.microsoft.com/office/word/2010/wordprocessingCanvas" xmlns:cx="http://schemas.microsoft.com/office/drawing/2014/chartex" xmlns:cx1="http://schemas.microsoft.com/office/drawing/2015/9/8/chartex" xmlns:cx2="http://schemas.microsoft.com/office/drawing/2015/10/21/chartex" xmlns:cx3="http://schemas.microsoft.com/office/drawing/2016/5/9/chartex" xmlns:cx4="http://schemas.microsoft.com/office/drawing/2016/5/10/chartex" xmlns:cx5="http://schemas.microsoft.com/office/drawing/2016/5/11/chartex" xmlns:cx6="http://schemas.microsoft.com/office/drawing/2016/5/12/chartex" xmlns:cx7="http://schemas.microsoft.com/office/drawing/2016/5/13/chartex" xmlns:cx8="http://schemas.microsoft.com/office/drawing/2016/5/14/chartex" xmlns:mc="http://schemas.openxmlformats.org/markup-compatibility/2006" xmlns:aink="http://schemas.microsoft.com/office/drawing/2016/ink" xmlns:am3d="http://schemas.microsoft.com/office/drawing/2017/model3d" xmlns:o="urn:schemas-microsoft-com:office:office" xmlns:oel="http://schemas.microsoft.com/office/2019/extlst" xmlns:r="http://schemas.openxmlformats.org/officeDocument/2006/relationships" xmlns:m="http://schemas.openxmlformats.org/officeDocument/2006/math" xmlns:v="urn:schemas-microsoft-com:vml" xmlns:wp14="http://schemas.microsoft.com/office/word/2010/wordprocessingDrawing" xmlns:wp="http://schemas.openxmlformats.org/drawingml/2006/wordprocessingDrawing" xmlns:w10="urn:schemas-microsoft-com:office:word" xmlns:w="http://schemas.openxmlformats.org/wordprocessingml/2006/main" xmlns:w14="http://schemas.microsoft.com/office/word/2010/wordml" xmlns:w15="http://schemas.microsoft.com/office/word/2012/wordml" xmlns:w16cex="http://schemas.microsoft.com/office/word/2018/wordml/cex" xmlns:w16cid="http://schemas.microsoft.com/office/word/2016/wordml/cid" xmlns:w16="http://schemas.microsoft.com/office/word/2018/wordml" xmlns:w16du="http://schemas.microsoft.com/office/word/2023/wordml/word16du" xmlns:w16sdtdh="http://schemas.microsoft.com/office/word/2020/wordml/sdtdatahash" xmlns:w16se="http://schemas.microsoft.com/office/word/2015/wordml/symex" xmlns:wpg="http://schemas.microsoft.com/office/word/2010/wordprocessingGroup" xmlns:wpi="http://schemas.microsoft.com/office/word/2010/wordprocessingInk" xmlns:wne="http://schemas.microsoft.com/office/word/2006/wordml" xmlns:wps="http://schemas.microsoft.com/office/word/2010/wordprocessingShape" mc:Ignorable="w14 w15 w16se w16cid w16 w16cex w16sdtdh w16du wp14">
   <w:abstractNum w:abstractNumId="0" w15:restartNumberingAfterBreak="0">
     <w:nsid w:val="2FF45558"/>
     <w:multiLevelType w:val="multilevel"/>
@@ -865,6 +853,453 @@
         </w:tabs>
         <w:ind w:left="6480" w:hanging="360"/>
       </w:pPr>
+    </w:lvl>
+  </w:abstractNum>
+  <w:abstractNum w:abstractNumId="2" w15:restartNumberingAfterBreak="0">
+    <w:nsid w:val="374460C2"/>
+    <w:multiLevelType w:val="multilevel"/>
+    <w:tmpl w:val="7EC844D0"/>
+    <w:lvl w:ilvl="0">
+      <w:start w:val="1"/>
+      <w:numFmt w:val="bullet"/>
+      <w:lvlText w:val=""/>
+      <w:lvlJc w:val="left"/>
+      <w:pPr>
+        <w:tabs>
+          <w:tab w:val="num" w:pos="720"/>
+        </w:tabs>
+        <w:ind w:left="720" w:hanging="360"/>
+      </w:pPr>
+      <w:rPr>
+        <w:rFonts w:ascii="Symbol" w:hAnsi="Symbol" w:hint="default"/>
+        <w:sz w:val="20"/>
+      </w:rPr>
+    </w:lvl>
+    <w:lvl w:ilvl="1" w:tentative="1">
+      <w:start w:val="1"/>
+      <w:numFmt w:val="bullet"/>
+      <w:lvlText w:val="o"/>
+      <w:lvlJc w:val="left"/>
+      <w:pPr>
+        <w:tabs>
+          <w:tab w:val="num" w:pos="1440"/>
+        </w:tabs>
+        <w:ind w:left="1440" w:hanging="360"/>
+      </w:pPr>
+      <w:rPr>
+        <w:rFonts w:ascii="Courier New" w:hAnsi="Courier New" w:hint="default"/>
+        <w:sz w:val="20"/>
+      </w:rPr>
+    </w:lvl>
+    <w:lvl w:ilvl="2" w:tentative="1">
+      <w:start w:val="1"/>
+      <w:numFmt w:val="bullet"/>
+      <w:lvlText w:val=""/>
+      <w:lvlJc w:val="left"/>
+      <w:pPr>
+        <w:tabs>
+          <w:tab w:val="num" w:pos="2160"/>
+        </w:tabs>
+        <w:ind w:left="2160" w:hanging="360"/>
+      </w:pPr>
+      <w:rPr>
+        <w:rFonts w:ascii="Wingdings" w:hAnsi="Wingdings" w:hint="default"/>
+        <w:sz w:val="20"/>
+      </w:rPr>
+    </w:lvl>
+    <w:lvl w:ilvl="3" w:tentative="1">
+      <w:start w:val="1"/>
+      <w:numFmt w:val="bullet"/>
+      <w:lvlText w:val=""/>
+      <w:lvlJc w:val="left"/>
+      <w:pPr>
+        <w:tabs>
+          <w:tab w:val="num" w:pos="2880"/>
+        </w:tabs>
+        <w:ind w:left="2880" w:hanging="360"/>
+      </w:pPr>
+      <w:rPr>
+        <w:rFonts w:ascii="Wingdings" w:hAnsi="Wingdings" w:hint="default"/>
+        <w:sz w:val="20"/>
+      </w:rPr>
+    </w:lvl>
+    <w:lvl w:ilvl="4" w:tentative="1">
+      <w:start w:val="1"/>
+      <w:numFmt w:val="bullet"/>
+      <w:lvlText w:val=""/>
+      <w:lvlJc w:val="left"/>
+      <w:pPr>
+        <w:tabs>
+          <w:tab w:val="num" w:pos="3600"/>
+        </w:tabs>
+        <w:ind w:left="3600" w:hanging="360"/>
+      </w:pPr>
+      <w:rPr>
+        <w:rFonts w:ascii="Wingdings" w:hAnsi="Wingdings" w:hint="default"/>
+        <w:sz w:val="20"/>
+      </w:rPr>
+    </w:lvl>
+    <w:lvl w:ilvl="5" w:tentative="1">
+      <w:start w:val="1"/>
+      <w:numFmt w:val="bullet"/>
+      <w:lvlText w:val=""/>
+      <w:lvlJc w:val="left"/>
+      <w:pPr>
+        <w:tabs>
+          <w:tab w:val="num" w:pos="4320"/>
+        </w:tabs>
+        <w:ind w:left="4320" w:hanging="360"/>
+      </w:pPr>
+      <w:rPr>
+        <w:rFonts w:ascii="Wingdings" w:hAnsi="Wingdings" w:hint="default"/>
+        <w:sz w:val="20"/>
+      </w:rPr>
+    </w:lvl>
+    <w:lvl w:ilvl="6" w:tentative="1">
+      <w:start w:val="1"/>
+      <w:numFmt w:val="bullet"/>
+      <w:lvlText w:val=""/>
+      <w:lvlJc w:val="left"/>
+      <w:pPr>
+        <w:tabs>
+          <w:tab w:val="num" w:pos="5040"/>
+        </w:tabs>
+        <w:ind w:left="5040" w:hanging="360"/>
+      </w:pPr>
+      <w:rPr>
+        <w:rFonts w:ascii="Wingdings" w:hAnsi="Wingdings" w:hint="default"/>
+        <w:sz w:val="20"/>
+      </w:rPr>
+    </w:lvl>
+    <w:lvl w:ilvl="7" w:tentative="1">
+      <w:start w:val="1"/>
+      <w:numFmt w:val="bullet"/>
+      <w:lvlText w:val=""/>
+      <w:lvlJc w:val="left"/>
+      <w:pPr>
+        <w:tabs>
+          <w:tab w:val="num" w:pos="5760"/>
+        </w:tabs>
+        <w:ind w:left="5760" w:hanging="360"/>
+      </w:pPr>
+      <w:rPr>
+        <w:rFonts w:ascii="Wingdings" w:hAnsi="Wingdings" w:hint="default"/>
+        <w:sz w:val="20"/>
+      </w:rPr>
+    </w:lvl>
+    <w:lvl w:ilvl="8" w:tentative="1">
+      <w:start w:val="1"/>
+      <w:numFmt w:val="bullet"/>
+      <w:lvlText w:val=""/>
+      <w:lvlJc w:val="left"/>
+      <w:pPr>
+        <w:tabs>
+          <w:tab w:val="num" w:pos="6480"/>
+        </w:tabs>
+        <w:ind w:left="6480" w:hanging="360"/>
+      </w:pPr>
+      <w:rPr>
+        <w:rFonts w:ascii="Wingdings" w:hAnsi="Wingdings" w:hint="default"/>
+        <w:sz w:val="20"/>
+      </w:rPr>
+    </w:lvl>
+  </w:abstractNum>
+  <w:abstractNum w:abstractNumId="3" w15:restartNumberingAfterBreak="0">
+    <w:nsid w:val="53DC630B"/>
+    <w:multiLevelType w:val="multilevel"/>
+    <w:tmpl w:val="BA004B52"/>
+    <w:lvl w:ilvl="0">
+      <w:start w:val="1"/>
+      <w:numFmt w:val="bullet"/>
+      <w:lvlText w:val=""/>
+      <w:lvlJc w:val="left"/>
+      <w:pPr>
+        <w:tabs>
+          <w:tab w:val="num" w:pos="720"/>
+        </w:tabs>
+        <w:ind w:left="720" w:hanging="360"/>
+      </w:pPr>
+      <w:rPr>
+        <w:rFonts w:ascii="Symbol" w:hAnsi="Symbol" w:hint="default"/>
+        <w:sz w:val="20"/>
+      </w:rPr>
+    </w:lvl>
+    <w:lvl w:ilvl="1" w:tentative="1">
+      <w:start w:val="1"/>
+      <w:numFmt w:val="bullet"/>
+      <w:lvlText w:val="o"/>
+      <w:lvlJc w:val="left"/>
+      <w:pPr>
+        <w:tabs>
+          <w:tab w:val="num" w:pos="1440"/>
+        </w:tabs>
+        <w:ind w:left="1440" w:hanging="360"/>
+      </w:pPr>
+      <w:rPr>
+        <w:rFonts w:ascii="Courier New" w:hAnsi="Courier New" w:hint="default"/>
+        <w:sz w:val="20"/>
+      </w:rPr>
+    </w:lvl>
+    <w:lvl w:ilvl="2" w:tentative="1">
+      <w:start w:val="1"/>
+      <w:numFmt w:val="bullet"/>
+      <w:lvlText w:val=""/>
+      <w:lvlJc w:val="left"/>
+      <w:pPr>
+        <w:tabs>
+          <w:tab w:val="num" w:pos="2160"/>
+        </w:tabs>
+        <w:ind w:left="2160" w:hanging="360"/>
+      </w:pPr>
+      <w:rPr>
+        <w:rFonts w:ascii="Wingdings" w:hAnsi="Wingdings" w:hint="default"/>
+        <w:sz w:val="20"/>
+      </w:rPr>
+    </w:lvl>
+    <w:lvl w:ilvl="3" w:tentative="1">
+      <w:start w:val="1"/>
+      <w:numFmt w:val="bullet"/>
+      <w:lvlText w:val=""/>
+      <w:lvlJc w:val="left"/>
+      <w:pPr>
+        <w:tabs>
+          <w:tab w:val="num" w:pos="2880"/>
+        </w:tabs>
+        <w:ind w:left="2880" w:hanging="360"/>
+      </w:pPr>
+      <w:rPr>
+        <w:rFonts w:ascii="Wingdings" w:hAnsi="Wingdings" w:hint="default"/>
+        <w:sz w:val="20"/>
+      </w:rPr>
+    </w:lvl>
+    <w:lvl w:ilvl="4" w:tentative="1">
+      <w:start w:val="1"/>
+      <w:numFmt w:val="bullet"/>
+      <w:lvlText w:val=""/>
+      <w:lvlJc w:val="left"/>
+      <w:pPr>
+        <w:tabs>
+          <w:tab w:val="num" w:pos="3600"/>
+        </w:tabs>
+        <w:ind w:left="3600" w:hanging="360"/>
+      </w:pPr>
+      <w:rPr>
+        <w:rFonts w:ascii="Wingdings" w:hAnsi="Wingdings" w:hint="default"/>
+        <w:sz w:val="20"/>
+      </w:rPr>
+    </w:lvl>
+    <w:lvl w:ilvl="5" w:tentative="1">
+      <w:start w:val="1"/>
+      <w:numFmt w:val="bullet"/>
+      <w:lvlText w:val=""/>
+      <w:lvlJc w:val="left"/>
+      <w:pPr>
+        <w:tabs>
+          <w:tab w:val="num" w:pos="4320"/>
+        </w:tabs>
+        <w:ind w:left="4320" w:hanging="360"/>
+      </w:pPr>
+      <w:rPr>
+        <w:rFonts w:ascii="Wingdings" w:hAnsi="Wingdings" w:hint="default"/>
+        <w:sz w:val="20"/>
+      </w:rPr>
+    </w:lvl>
+    <w:lvl w:ilvl="6" w:tentative="1">
+      <w:start w:val="1"/>
+      <w:numFmt w:val="bullet"/>
+      <w:lvlText w:val=""/>
+      <w:lvlJc w:val="left"/>
+      <w:pPr>
+        <w:tabs>
+          <w:tab w:val="num" w:pos="5040"/>
+        </w:tabs>
+        <w:ind w:left="5040" w:hanging="360"/>
+      </w:pPr>
+      <w:rPr>
+        <w:rFonts w:ascii="Wingdings" w:hAnsi="Wingdings" w:hint="default"/>
+        <w:sz w:val="20"/>
+      </w:rPr>
+    </w:lvl>
+    <w:lvl w:ilvl="7" w:tentative="1">
+      <w:start w:val="1"/>
+      <w:numFmt w:val="bullet"/>
+      <w:lvlText w:val=""/>
+      <w:lvlJc w:val="left"/>
+      <w:pPr>
+        <w:tabs>
+          <w:tab w:val="num" w:pos="5760"/>
+        </w:tabs>
+        <w:ind w:left="5760" w:hanging="360"/>
+      </w:pPr>
+      <w:rPr>
+        <w:rFonts w:ascii="Wingdings" w:hAnsi="Wingdings" w:hint="default"/>
+        <w:sz w:val="20"/>
+      </w:rPr>
+    </w:lvl>
+    <w:lvl w:ilvl="8" w:tentative="1">
+      <w:start w:val="1"/>
+      <w:numFmt w:val="bullet"/>
+      <w:lvlText w:val=""/>
+      <w:lvlJc w:val="left"/>
+      <w:pPr>
+        <w:tabs>
+          <w:tab w:val="num" w:pos="6480"/>
+        </w:tabs>
+        <w:ind w:left="6480" w:hanging="360"/>
+      </w:pPr>
+      <w:rPr>
+        <w:rFonts w:ascii="Wingdings" w:hAnsi="Wingdings" w:hint="default"/>
+        <w:sz w:val="20"/>
+      </w:rPr>
+    </w:lvl>
+  </w:abstractNum>
+  <w:abstractNum w:abstractNumId="4" w15:restartNumberingAfterBreak="0">
+    <w:nsid w:val="7D904416"/>
+    <w:multiLevelType w:val="multilevel"/>
+    <w:tmpl w:val="630ADF7C"/>
+    <w:lvl w:ilvl="0">
+      <w:start w:val="1"/>
+      <w:numFmt w:val="bullet"/>
+      <w:lvlText w:val=""/>
+      <w:lvlJc w:val="left"/>
+      <w:pPr>
+        <w:tabs>
+          <w:tab w:val="num" w:pos="720"/>
+        </w:tabs>
+        <w:ind w:left="720" w:hanging="360"/>
+      </w:pPr>
+      <w:rPr>
+        <w:rFonts w:ascii="Symbol" w:hAnsi="Symbol" w:hint="default"/>
+        <w:sz w:val="20"/>
+      </w:rPr>
+    </w:lvl>
+    <w:lvl w:ilvl="1" w:tentative="1">
+      <w:start w:val="1"/>
+      <w:numFmt w:val="bullet"/>
+      <w:lvlText w:val="o"/>
+      <w:lvlJc w:val="left"/>
+      <w:pPr>
+        <w:tabs>
+          <w:tab w:val="num" w:pos="1440"/>
+        </w:tabs>
+        <w:ind w:left="1440" w:hanging="360"/>
+      </w:pPr>
+      <w:rPr>
+        <w:rFonts w:ascii="Courier New" w:hAnsi="Courier New" w:hint="default"/>
+        <w:sz w:val="20"/>
+      </w:rPr>
+    </w:lvl>
+    <w:lvl w:ilvl="2" w:tentative="1">
+      <w:start w:val="1"/>
+      <w:numFmt w:val="bullet"/>
+      <w:lvlText w:val=""/>
+      <w:lvlJc w:val="left"/>
+      <w:pPr>
+        <w:tabs>
+          <w:tab w:val="num" w:pos="2160"/>
+        </w:tabs>
+        <w:ind w:left="2160" w:hanging="360"/>
+      </w:pPr>
+      <w:rPr>
+        <w:rFonts w:ascii="Wingdings" w:hAnsi="Wingdings" w:hint="default"/>
+        <w:sz w:val="20"/>
+      </w:rPr>
+    </w:lvl>
+    <w:lvl w:ilvl="3" w:tentative="1">
+      <w:start w:val="1"/>
+      <w:numFmt w:val="bullet"/>
+      <w:lvlText w:val=""/>
+      <w:lvlJc w:val="left"/>
+      <w:pPr>
+        <w:tabs>
+          <w:tab w:val="num" w:pos="2880"/>
+        </w:tabs>
+        <w:ind w:left="2880" w:hanging="360"/>
+      </w:pPr>
+      <w:rPr>
+        <w:rFonts w:ascii="Wingdings" w:hAnsi="Wingdings" w:hint="default"/>
+        <w:sz w:val="20"/>
+      </w:rPr>
+    </w:lvl>
+    <w:lvl w:ilvl="4" w:tentative="1">
+      <w:start w:val="1"/>
+      <w:numFmt w:val="bullet"/>
+      <w:lvlText w:val=""/>
+      <w:lvlJc w:val="left"/>
+      <w:pPr>
+        <w:tabs>
+          <w:tab w:val="num" w:pos="3600"/>
+        </w:tabs>
+        <w:ind w:left="3600" w:hanging="360"/>
+      </w:pPr>
+      <w:rPr>
+        <w:rFonts w:ascii="Wingdings" w:hAnsi="Wingdings" w:hint="default"/>
+        <w:sz w:val="20"/>
+      </w:rPr>
+    </w:lvl>
+    <w:lvl w:ilvl="5" w:tentative="1">
+      <w:start w:val="1"/>
+      <w:numFmt w:val="bullet"/>
+      <w:lvlText w:val=""/>
+      <w:lvlJc w:val="left"/>
+      <w:pPr>
+        <w:tabs>
+          <w:tab w:val="num" w:pos="4320"/>
+        </w:tabs>
+        <w:ind w:left="4320" w:hanging="360"/>
+      </w:pPr>
+      <w:rPr>
+        <w:rFonts w:ascii="Wingdings" w:hAnsi="Wingdings" w:hint="default"/>
+        <w:sz w:val="20"/>
+      </w:rPr>
+    </w:lvl>
+    <w:lvl w:ilvl="6" w:tentative="1">
+      <w:start w:val="1"/>
+      <w:numFmt w:val="bullet"/>
+      <w:lvlText w:val=""/>
+      <w:lvlJc w:val="left"/>
+      <w:pPr>
+        <w:tabs>
+          <w:tab w:val="num" w:pos="5040"/>
+        </w:tabs>
+        <w:ind w:left="5040" w:hanging="360"/>
+      </w:pPr>
+      <w:rPr>
+        <w:rFonts w:ascii="Wingdings" w:hAnsi="Wingdings" w:hint="default"/>
+        <w:sz w:val="20"/>
+      </w:rPr>
+    </w:lvl>
+    <w:lvl w:ilvl="7" w:tentative="1">
+      <w:start w:val="1"/>
+      <w:numFmt w:val="bullet"/>
+      <w:lvlText w:val=""/>
+      <w:lvlJc w:val="left"/>
+      <w:pPr>
+        <w:tabs>
+          <w:tab w:val="num" w:pos="5760"/>
+        </w:tabs>
+        <w:ind w:left="5760" w:hanging="360"/>
+      </w:pPr>
+      <w:rPr>
+        <w:rFonts w:ascii="Wingdings" w:hAnsi="Wingdings" w:hint="default"/>
+        <w:sz w:val="20"/>
+      </w:rPr>
+    </w:lvl>
+    <w:lvl w:ilvl="8" w:tentative="1">
+      <w:start w:val="1"/>
+      <w:numFmt w:val="bullet"/>
+      <w:lvlText w:val=""/>
+      <w:lvlJc w:val="left"/>
+      <w:pPr>
+        <w:tabs>
+          <w:tab w:val="num" w:pos="6480"/>
+        </w:tabs>
+        <w:ind w:left="6480" w:hanging="360"/>
+      </w:pPr>
+      <w:rPr>
+        <w:rFonts w:ascii="Wingdings" w:hAnsi="Wingdings" w:hint="default"/>
+        <w:sz w:val="20"/>
+      </w:rPr>
     </w:lvl>
   </w:abstractNum>
   <w:num w:numId="1" w16cid:durableId="1053771328">
@@ -873,11 +1308,20 @@
   <w:num w:numId="2" w16cid:durableId="896091845">
     <w:abstractNumId w:val="1"/>
   </w:num>
+  <w:num w:numId="3" w16cid:durableId="974406368">
+    <w:abstractNumId w:val="2"/>
+  </w:num>
+  <w:num w:numId="4" w16cid:durableId="2080900472">
+    <w:abstractNumId w:val="3"/>
+  </w:num>
+  <w:num w:numId="5" w16cid:durableId="285964528">
+    <w:abstractNumId w:val="4"/>
+  </w:num>
 </w:numbering>
 </file>
 
 <file path=word/styles.xml><?xml version="1.0" encoding="utf-8"?>
-<w:styles xmlns:mc="http://schemas.openxmlformats.org/markup-compatibility/2006" xmlns:r="http://schemas.openxmlformats.org/officeDocument/2006/relationships" xmlns:w="http://schemas.openxmlformats.org/wordprocessingml/2006/main" xmlns:w14="http://schemas.microsoft.com/office/word/2010/wordml" xmlns:w15="http://schemas.microsoft.com/office/word/2012/wordml" xmlns:w16cex="http://schemas.microsoft.com/office/word/2018/wordml/cex" xmlns:w16cid="http://schemas.microsoft.com/office/word/2016/wordml/cid" xmlns:w16="http://schemas.microsoft.com/office/word/2018/wordml" xmlns:w16du="http://schemas.microsoft.com/office/word/2023/wordml/word16du" xmlns:w16sdtdh="http://schemas.microsoft.com/office/word/2020/wordml/sdtdatahash" xmlns:w16sdtfl="http://schemas.microsoft.com/office/word/2024/wordml/sdtformatlock" xmlns:w16se="http://schemas.microsoft.com/office/word/2015/wordml/symex" mc:Ignorable="w14 w15 w16se w16cid w16 w16cex w16sdtdh w16sdtfl w16du">
+<w:styles xmlns:mc="http://schemas.openxmlformats.org/markup-compatibility/2006" xmlns:r="http://schemas.openxmlformats.org/officeDocument/2006/relationships" xmlns:w="http://schemas.openxmlformats.org/wordprocessingml/2006/main" xmlns:w14="http://schemas.microsoft.com/office/word/2010/wordml" xmlns:w15="http://schemas.microsoft.com/office/word/2012/wordml" xmlns:w16cex="http://schemas.microsoft.com/office/word/2018/wordml/cex" xmlns:w16cid="http://schemas.microsoft.com/office/word/2016/wordml/cid" xmlns:w16="http://schemas.microsoft.com/office/word/2018/wordml" xmlns:w16du="http://schemas.microsoft.com/office/word/2023/wordml/word16du" xmlns:w16sdtdh="http://schemas.microsoft.com/office/word/2020/wordml/sdtdatahash" xmlns:w16se="http://schemas.microsoft.com/office/word/2015/wordml/symex" mc:Ignorable="w14 w15 w16se w16cid w16 w16cex w16sdtdh w16du">
   <w:docDefaults>
     <w:rPrDefault>
       <w:rPr>
@@ -1477,6 +1921,7 @@
   <w:style w:type="character" w:default="1" w:styleId="DefaultParagraphFont">
     <w:name w:val="Default Paragraph Font"/>
     <w:uiPriority w:val="1"/>
+    <w:semiHidden/>
     <w:unhideWhenUsed/>
   </w:style>
   <w:style w:type="table" w:default="1" w:styleId="TableNormal">
@@ -1790,6 +2235,41 @@
       <w:color w:val="365F91" w:themeColor="accent1" w:themeShade="BF"/>
       <w:spacing w:val="5"/>
     </w:rPr>
+  </w:style>
+  <w:style w:type="paragraph" w:styleId="NormalWeb">
+    <w:name w:val="Normal (Web)"/>
+    <w:basedOn w:val="Normal"/>
+    <w:uiPriority w:val="99"/>
+    <w:unhideWhenUsed/>
+    <w:rsid w:val="00711A6D"/>
+    <w:pPr>
+      <w:spacing w:before="100" w:beforeAutospacing="1" w:after="100" w:afterAutospacing="1" w:line="240" w:lineRule="auto"/>
+    </w:pPr>
+    <w:rPr>
+      <w:rFonts w:ascii="Times New Roman" w:eastAsia="Times New Roman" w:hAnsi="Times New Roman" w:cs="Times New Roman"/>
+      <w:sz w:val="24"/>
+      <w:szCs w:val="24"/>
+    </w:rPr>
+  </w:style>
+  <w:style w:type="character" w:styleId="Strong">
+    <w:name w:val="Strong"/>
+    <w:basedOn w:val="DefaultParagraphFont"/>
+    <w:uiPriority w:val="22"/>
+    <w:qFormat/>
+    <w:rsid w:val="00711A6D"/>
+    <w:rPr>
+      <w:b/>
+      <w:bCs/>
+    </w:rPr>
+  </w:style>
+  <w:style w:type="paragraph" w:styleId="NoSpacing">
+    <w:name w:val="No Spacing"/>
+    <w:uiPriority w:val="1"/>
+    <w:qFormat/>
+    <w:rsid w:val="00774427"/>
+    <w:pPr>
+      <w:spacing w:after="0" w:line="240" w:lineRule="auto"/>
+    </w:pPr>
   </w:style>
 </w:styles>
 </file>

</xml_diff>